<commit_message>
Actualizacion Licencias y Cuadernillos
</commit_message>
<xml_diff>
--- a/01-docentes/Anexo-Ajustes-Razonables-STEAM.docx
+++ b/01-docentes/Anexo-Ajustes-Razonables-STEAM.docx
@@ -9442,7 +9442,7 @@
           <w:sz w:val="19"/>
           <w:szCs w:val="19"/>
         </w:rPr>
-        <w:t xml:space="preserve">Dr. Emmanuelle Ruelas Gómez, Ing. Daniel Millan Alcantara, Mtra. Emarinia Angulo Camacho, Mtra. Miriam Melero Hernández</w:t>
+        <w:t xml:space="preserve">Dr. Emmanuelle Ruelas Gómez, Ing. Daniel Millan Coronado, Mtra. Emarinia Angulo Camacho, Mtra. Miriam Melero Hernández, Dra. Silvia Lizeth Becerra Rojas, M en C. Maritza Patricia López Solorio</w:t>
       </w:r>
     </w:p>
     <w:p>
@@ -9508,7 +9508,7 @@
           <w:sz w:val="19"/>
           <w:szCs w:val="19"/>
         </w:rPr>
-        <w:t xml:space="preserve">Ing. Daniel Millan Alcantara, Dra. Verónica Rojas Mendizábal</w:t>
+        <w:t xml:space="preserve">Ing. Daniel Millan Coronado, Dra. Verónica Rojas Mendizábal</w:t>
       </w:r>
     </w:p>
     <w:p>

</xml_diff>